<commit_message>
Arquitectura del proyecto y más decisiones
</commit_message>
<xml_diff>
--- a/Registro_de_Decisiones_Gimnasio.docx
+++ b/Registro_de_Decisiones_Gimnasio.docx
@@ -2008,6 +2008,374 @@
           </w:p>
         </w:tc>
       </w:tr>
+      <w:tr>
+        <w:trPr>
+          <w:tblHeader w:val="false"/>
+        </w:trPr>
+        <w:tc>
+          <w:tcPr>
+            <w:tcW w:type="dxa" w:w="954"/>
+            <w:tcBorders>
+              <w:top w:val="single" w:color="BFBFBF" w:sz="4"/>
+              <w:left w:val="single" w:color="BFBFBF" w:sz="4"/>
+              <w:bottom w:val="single" w:color="BFBFBF" w:sz="4"/>
+              <w:right w:val="single" w:color="BFBFBF" w:sz="4"/>
+            </w:tcBorders>
+            <w:tcMar>
+              <w:top w:type="dxa" w:w="60"/>
+              <w:left w:type="dxa" w:w="100"/>
+              <w:bottom w:type="dxa" w:w="60"/>
+              <w:right w:type="dxa" w:w="100"/>
+            </w:tcMar>
+          </w:tcPr>
+          <w:p>
+            <w:pPr>
+              <w:spacing w:after="0"/>
+            </w:pPr>
+            <w:r>
+              <w:rPr>
+                <w:sz w:val="18"/>
+                <w:szCs w:val="18"/>
+              </w:rPr>
+              <w:t xml:space="preserve">D-20</w:t>
+            </w:r>
+          </w:p>
+        </w:tc>
+        <w:tc>
+          <w:tcPr>
+            <w:tcW w:type="dxa" w:w="2958"/>
+            <w:tcBorders>
+              <w:top w:val="single" w:color="BFBFBF" w:sz="4"/>
+              <w:left w:val="single" w:color="BFBFBF" w:sz="4"/>
+              <w:bottom w:val="single" w:color="BFBFBF" w:sz="4"/>
+              <w:right w:val="single" w:color="BFBFBF" w:sz="4"/>
+            </w:tcBorders>
+            <w:tcMar>
+              <w:top w:type="dxa" w:w="60"/>
+              <w:left w:type="dxa" w:w="100"/>
+              <w:bottom w:type="dxa" w:w="60"/>
+              <w:right w:type="dxa" w:w="100"/>
+            </w:tcMar>
+          </w:tcPr>
+          <w:p>
+            <w:pPr>
+              <w:spacing w:after="0"/>
+            </w:pPr>
+            <w:r>
+              <w:rPr>
+                <w:sz w:val="18"/>
+                <w:szCs w:val="18"/>
+              </w:rPr>
+              <w:t xml:space="preserve">Cancelación de reservas por membresía o baja (arquitectura)</w:t>
+            </w:r>
+          </w:p>
+        </w:tc>
+        <w:tc>
+          <w:tcPr>
+            <w:tcW w:type="dxa" w:w="5726"/>
+            <w:tcBorders>
+              <w:top w:val="single" w:color="BFBFBF" w:sz="4"/>
+              <w:left w:val="single" w:color="BFBFBF" w:sz="4"/>
+              <w:bottom w:val="single" w:color="BFBFBF" w:sz="4"/>
+              <w:right w:val="single" w:color="BFBFBF" w:sz="4"/>
+            </w:tcBorders>
+            <w:tcMar>
+              <w:top w:type="dxa" w:w="60"/>
+              <w:left w:type="dxa" w:w="100"/>
+              <w:bottom w:type="dxa" w:w="60"/>
+              <w:right w:type="dxa" w:w="100"/>
+            </w:tcMar>
+          </w:tcPr>
+          <w:p>
+            <w:pPr>
+              <w:spacing w:after="0"/>
+            </w:pPr>
+            <w:r>
+              <w:rPr>
+                <w:sz w:val="18"/>
+                <w:szCs w:val="18"/>
+              </w:rPr>
+              <w:t xml:space="preserve">members-service publica los eventos membresia.cancelada y usuario.desactivado; booking-service los consume y cancela las reservas futuras del alumno (RN-04, RN-34). Ver docs/ARCHITECTURE.md §6–7 y ADR-005.</w:t>
+            </w:r>
+          </w:p>
+        </w:tc>
+      </w:tr>
+      <w:tr>
+        <w:trPr>
+          <w:tblHeader w:val="false"/>
+        </w:trPr>
+        <w:tc>
+          <w:tcPr>
+            <w:tcW w:type="dxa" w:w="954"/>
+            <w:tcBorders>
+              <w:top w:val="single" w:color="BFBFBF" w:sz="4"/>
+              <w:left w:val="single" w:color="BFBFBF" w:sz="4"/>
+              <w:bottom w:val="single" w:color="BFBFBF" w:sz="4"/>
+              <w:right w:val="single" w:color="BFBFBF" w:sz="4"/>
+            </w:tcBorders>
+            <w:tcMar>
+              <w:top w:type="dxa" w:w="60"/>
+              <w:left w:type="dxa" w:w="100"/>
+              <w:bottom w:type="dxa" w:w="60"/>
+              <w:right w:type="dxa" w:w="100"/>
+            </w:tcMar>
+          </w:tcPr>
+          <w:p>
+            <w:pPr>
+              <w:spacing w:after="0"/>
+            </w:pPr>
+            <w:r>
+              <w:rPr>
+                <w:sz w:val="18"/>
+                <w:szCs w:val="18"/>
+              </w:rPr>
+              <w:t xml:space="preserve">D-21</w:t>
+            </w:r>
+          </w:p>
+        </w:tc>
+        <w:tc>
+          <w:tcPr>
+            <w:tcW w:type="dxa" w:w="2958"/>
+            <w:tcBorders>
+              <w:top w:val="single" w:color="BFBFBF" w:sz="4"/>
+              <w:left w:val="single" w:color="BFBFBF" w:sz="4"/>
+              <w:bottom w:val="single" w:color="BFBFBF" w:sz="4"/>
+              <w:right w:val="single" w:color="BFBFBF" w:sz="4"/>
+            </w:tcBorders>
+            <w:tcMar>
+              <w:top w:type="dxa" w:w="60"/>
+              <w:left w:type="dxa" w:w="100"/>
+              <w:bottom w:type="dxa" w:w="60"/>
+              <w:right w:type="dxa" w:w="100"/>
+            </w:tcMar>
+          </w:tcPr>
+          <w:p>
+            <w:pPr>
+              <w:spacing w:after="0"/>
+            </w:pPr>
+            <w:r>
+              <w:rPr>
+                <w:sz w:val="18"/>
+                <w:szCs w:val="18"/>
+              </w:rPr>
+              <w:t xml:space="preserve">Asignaciones en training-service (arquitectura)</w:t>
+            </w:r>
+          </w:p>
+        </w:tc>
+        <w:tc>
+          <w:tcPr>
+            <w:tcW w:type="dxa" w:w="5726"/>
+            <w:tcBorders>
+              <w:top w:val="single" w:color="BFBFBF" w:sz="4"/>
+              <w:left w:val="single" w:color="BFBFBF" w:sz="4"/>
+              <w:bottom w:val="single" w:color="BFBFBF" w:sz="4"/>
+              <w:right w:val="single" w:color="BFBFBF" w:sz="4"/>
+            </w:tcBorders>
+            <w:tcMar>
+              <w:top w:type="dxa" w:w="60"/>
+              <w:left w:type="dxa" w:w="100"/>
+              <w:bottom w:type="dxa" w:w="60"/>
+              <w:right w:type="dxa" w:w="100"/>
+            </w:tcMar>
+          </w:tcPr>
+          <w:p>
+            <w:pPr>
+              <w:spacing w:after="0"/>
+            </w:pPr>
+            <w:r>
+              <w:rPr>
+                <w:sz w:val="18"/>
+                <w:szCs w:val="18"/>
+              </w:rPr>
+              <w:t xml:space="preserve">training-service le consulta a members-service si el alumno está asignado al profesional antes de cada operación, con caché de 60 segundos (RN-30). Ver ADR-005.</w:t>
+            </w:r>
+          </w:p>
+        </w:tc>
+      </w:tr>
+      <w:tr>
+        <w:trPr>
+          <w:tblHeader w:val="false"/>
+        </w:trPr>
+        <w:tc>
+          <w:tcPr>
+            <w:tcW w:type="dxa" w:w="954"/>
+            <w:tcBorders>
+              <w:top w:val="single" w:color="BFBFBF" w:sz="4"/>
+              <w:left w:val="single" w:color="BFBFBF" w:sz="4"/>
+              <w:bottom w:val="single" w:color="BFBFBF" w:sz="4"/>
+              <w:right w:val="single" w:color="BFBFBF" w:sz="4"/>
+            </w:tcBorders>
+            <w:tcMar>
+              <w:top w:type="dxa" w:w="60"/>
+              <w:left w:type="dxa" w:w="100"/>
+              <w:bottom w:type="dxa" w:w="60"/>
+              <w:right w:type="dxa" w:w="100"/>
+            </w:tcMar>
+          </w:tcPr>
+          <w:p>
+            <w:pPr>
+              <w:spacing w:after="0"/>
+            </w:pPr>
+            <w:r>
+              <w:rPr>
+                <w:sz w:val="18"/>
+                <w:szCs w:val="18"/>
+              </w:rPr>
+              <w:t xml:space="preserve">D-22</w:t>
+            </w:r>
+          </w:p>
+        </w:tc>
+        <w:tc>
+          <w:tcPr>
+            <w:tcW w:type="dxa" w:w="2958"/>
+            <w:tcBorders>
+              <w:top w:val="single" w:color="BFBFBF" w:sz="4"/>
+              <w:left w:val="single" w:color="BFBFBF" w:sz="4"/>
+              <w:bottom w:val="single" w:color="BFBFBF" w:sz="4"/>
+              <w:right w:val="single" w:color="BFBFBF" w:sz="4"/>
+            </w:tcBorders>
+            <w:tcMar>
+              <w:top w:type="dxa" w:w="60"/>
+              <w:left w:type="dxa" w:w="100"/>
+              <w:bottom w:type="dxa" w:w="60"/>
+              <w:right w:type="dxa" w:w="100"/>
+            </w:tcMar>
+          </w:tcPr>
+          <w:p>
+            <w:pPr>
+              <w:spacing w:after="0"/>
+            </w:pPr>
+            <w:r>
+              <w:rPr>
+                <w:sz w:val="18"/>
+                <w:szCs w:val="18"/>
+              </w:rPr>
+              <w:t xml:space="preserve">Nombres de alumnos en los listados (arquitectura)</w:t>
+            </w:r>
+          </w:p>
+        </w:tc>
+        <w:tc>
+          <w:tcPr>
+            <w:tcW w:type="dxa" w:w="5726"/>
+            <w:tcBorders>
+              <w:top w:val="single" w:color="BFBFBF" w:sz="4"/>
+              <w:left w:val="single" w:color="BFBFBF" w:sz="4"/>
+              <w:bottom w:val="single" w:color="BFBFBF" w:sz="4"/>
+              <w:right w:val="single" w:color="BFBFBF" w:sz="4"/>
+            </w:tcBorders>
+            <w:tcMar>
+              <w:top w:type="dxa" w:w="60"/>
+              <w:left w:type="dxa" w:w="100"/>
+              <w:bottom w:type="dxa" w:w="60"/>
+              <w:right w:type="dxa" w:w="100"/>
+            </w:tcMar>
+          </w:tcPr>
+          <w:p>
+            <w:pPr>
+              <w:spacing w:after="0"/>
+            </w:pPr>
+            <w:r>
+              <w:rPr>
+                <w:sz w:val="18"/>
+                <w:szCs w:val="18"/>
+              </w:rPr>
+              <w:t xml:space="preserve">booking-service le pide a members-service los nombres de los alumnos de una clase. Si members-service no responde, el listado se muestra con los IDs y sin nombres (HU-21). Ver ADR-005.</w:t>
+            </w:r>
+          </w:p>
+        </w:tc>
+      </w:tr>
+      <w:tr>
+        <w:trPr>
+          <w:tblHeader w:val="false"/>
+        </w:trPr>
+        <w:tc>
+          <w:tcPr>
+            <w:tcW w:type="dxa" w:w="954"/>
+            <w:tcBorders>
+              <w:top w:val="single" w:color="BFBFBF" w:sz="4"/>
+              <w:left w:val="single" w:color="BFBFBF" w:sz="4"/>
+              <w:bottom w:val="single" w:color="BFBFBF" w:sz="4"/>
+              <w:right w:val="single" w:color="BFBFBF" w:sz="4"/>
+            </w:tcBorders>
+            <w:tcMar>
+              <w:top w:type="dxa" w:w="60"/>
+              <w:left w:type="dxa" w:w="100"/>
+              <w:bottom w:type="dxa" w:w="60"/>
+              <w:right w:type="dxa" w:w="100"/>
+            </w:tcMar>
+          </w:tcPr>
+          <w:p>
+            <w:pPr>
+              <w:spacing w:after="0"/>
+            </w:pPr>
+            <w:r>
+              <w:rPr>
+                <w:sz w:val="18"/>
+                <w:szCs w:val="18"/>
+              </w:rPr>
+              <w:t xml:space="preserve">D-23</w:t>
+            </w:r>
+          </w:p>
+        </w:tc>
+        <w:tc>
+          <w:tcPr>
+            <w:tcW w:type="dxa" w:w="2958"/>
+            <w:tcBorders>
+              <w:top w:val="single" w:color="BFBFBF" w:sz="4"/>
+              <w:left w:val="single" w:color="BFBFBF" w:sz="4"/>
+              <w:bottom w:val="single" w:color="BFBFBF" w:sz="4"/>
+              <w:right w:val="single" w:color="BFBFBF" w:sz="4"/>
+            </w:tcBorders>
+            <w:tcMar>
+              <w:top w:type="dxa" w:w="60"/>
+              <w:left w:type="dxa" w:w="100"/>
+              <w:bottom w:type="dxa" w:w="60"/>
+              <w:right w:type="dxa" w:w="100"/>
+            </w:tcMar>
+          </w:tcPr>
+          <w:p>
+            <w:pPr>
+              <w:spacing w:after="0"/>
+            </w:pPr>
+            <w:r>
+              <w:rPr>
+                <w:sz w:val="18"/>
+                <w:szCs w:val="18"/>
+              </w:rPr>
+              <w:t xml:space="preserve">Despliegue en la nube (arquitectura)</w:t>
+            </w:r>
+          </w:p>
+        </w:tc>
+        <w:tc>
+          <w:tcPr>
+            <w:tcW w:type="dxa" w:w="5726"/>
+            <w:tcBorders>
+              <w:top w:val="single" w:color="BFBFBF" w:sz="4"/>
+              <w:left w:val="single" w:color="BFBFBF" w:sz="4"/>
+              <w:bottom w:val="single" w:color="BFBFBF" w:sz="4"/>
+              <w:right w:val="single" w:color="BFBFBF" w:sz="4"/>
+            </w:tcBorders>
+            <w:tcMar>
+              <w:top w:type="dxa" w:w="60"/>
+              <w:left w:type="dxa" w:w="100"/>
+              <w:bottom w:type="dxa" w:w="60"/>
+              <w:right w:type="dxa" w:w="100"/>
+            </w:tcMar>
+          </w:tcPr>
+          <w:p>
+            <w:pPr>
+              <w:spacing w:after="0"/>
+            </w:pPr>
+            <w:r>
+              <w:rPr>
+                <w:sz w:val="18"/>
+                <w:szCs w:val="18"/>
+              </w:rPr>
+              <w:t xml:space="preserve">Todo el sistema en una VM con Docker Compose, igual que en local. Solo el api-gateway queda expuesto a Internet por HTTPS. Proveedor de nube todavía no elegido. Ver docs/ARCHITECTURE.md §14.2.</w:t>
+            </w:r>
+          </w:p>
+        </w:tc>
+      </w:tr>
     </w:tbl>
     <w:p>
       <w:pPr>
@@ -2185,6 +2553,69 @@
                 <w:szCs w:val="18"/>
               </w:rPr>
               <w:t xml:space="preserve">Creación del registro con las decisiones D-01 a D-19.</w:t>
+            </w:r>
+          </w:p>
+        </w:tc>
+      </w:tr>
+      <w:tr>
+        <w:trPr>
+          <w:tblHeader w:val="false"/>
+        </w:trPr>
+        <w:tc>
+          <w:tcPr>
+            <w:tcW w:type="dxa" w:w="2234"/>
+            <w:tcBorders>
+              <w:top w:val="single" w:color="BFBFBF" w:sz="4"/>
+              <w:left w:val="single" w:color="BFBFBF" w:sz="4"/>
+              <w:bottom w:val="single" w:color="BFBFBF" w:sz="4"/>
+              <w:right w:val="single" w:color="BFBFBF" w:sz="4"/>
+            </w:tcBorders>
+            <w:tcMar>
+              <w:top w:type="dxa" w:w="60"/>
+              <w:left w:type="dxa" w:w="100"/>
+              <w:bottom w:type="dxa" w:w="60"/>
+              <w:right w:type="dxa" w:w="100"/>
+            </w:tcMar>
+          </w:tcPr>
+          <w:p>
+            <w:pPr>
+              <w:spacing w:after="0"/>
+            </w:pPr>
+            <w:r>
+              <w:rPr>
+                <w:sz w:val="18"/>
+                <w:szCs w:val="18"/>
+              </w:rPr>
+              <w:t xml:space="preserve">07/10/2026</w:t>
+            </w:r>
+          </w:p>
+        </w:tc>
+        <w:tc>
+          <w:tcPr>
+            <w:tcW w:type="dxa" w:w="7404"/>
+            <w:tcBorders>
+              <w:top w:val="single" w:color="BFBFBF" w:sz="4"/>
+              <w:left w:val="single" w:color="BFBFBF" w:sz="4"/>
+              <w:bottom w:val="single" w:color="BFBFBF" w:sz="4"/>
+              <w:right w:val="single" w:color="BFBFBF" w:sz="4"/>
+            </w:tcBorders>
+            <w:tcMar>
+              <w:top w:type="dxa" w:w="60"/>
+              <w:left w:type="dxa" w:w="100"/>
+              <w:bottom w:type="dxa" w:w="60"/>
+              <w:right w:type="dxa" w:w="100"/>
+            </w:tcMar>
+          </w:tcPr>
+          <w:p>
+            <w:pPr>
+              <w:spacing w:after="0"/>
+            </w:pPr>
+            <w:r>
+              <w:rPr>
+                <w:sz w:val="18"/>
+                <w:szCs w:val="18"/>
+              </w:rPr>
+              <w:t xml:space="preserve">Se agregan D-20 a D-23: decisiones de arquitectura aprobadas por el grupo en la etapa 02 (eventos de cancelación, asignaciones, nombres de alumnos y despliegue en la nube).</w:t>
             </w:r>
           </w:p>
         </w:tc>

</xml_diff>

<commit_message>
Modifico documentacion y decisiones de arquitectura
</commit_message>
<xml_diff>
--- a/Registro_de_Decisiones_Gimnasio.docx
+++ b/Registro_de_Decisiones_Gimnasio.docx
@@ -89,10 +89,7 @@
         <w:spacing w:after="60"/>
       </w:pPr>
       <w:r>
-        <w:t>Si una decisión cambi</w:t>
-      </w:r>
-      <w:r>
-        <w:t>a, no se borra: se marca como reemplazada en "Decisiones reemplazadas" y la nueva indica a cuál reemplaza.</w:t>
+        <w:t>Si una decisión cambia, no se borra: se marca como reemplazada en "Decisiones reemplazadas" y la nueva indica a cuál reemplaza.</w:t>
       </w:r>
     </w:p>
     <w:p>
@@ -113,10 +110,7 @@
         <w:pStyle w:val="Ttulo1"/>
       </w:pPr>
       <w:r>
-        <w:t>Decisiones</w:t>
-      </w:r>
-      <w:r>
-        <w:t xml:space="preserve"> confirmadas</w:t>
+        <w:t>Decisiones confirmadas</w:t>
       </w:r>
     </w:p>
     <w:tbl>
@@ -143,12 +137,6 @@
         <w:gridCol w:w="5726"/>
       </w:tblGrid>
       <w:tr>
-        <w:tblPrEx>
-          <w:tblCellMar>
-            <w:top w:w="0" w:type="dxa"/>
-            <w:bottom w:w="0" w:type="dxa"/>
-          </w:tblCellMar>
-        </w:tblPrEx>
         <w:trPr>
           <w:tblHeader/>
         </w:trPr>
@@ -244,12 +232,6 @@
         </w:tc>
       </w:tr>
       <w:tr>
-        <w:tblPrEx>
-          <w:tblCellMar>
-            <w:top w:w="0" w:type="dxa"/>
-            <w:bottom w:w="0" w:type="dxa"/>
-          </w:tblCellMar>
-        </w:tblPrEx>
         <w:tc>
           <w:tcPr>
             <w:tcW w:w="954" w:type="dxa"/>
@@ -330,12 +312,6 @@
         </w:tc>
       </w:tr>
       <w:tr>
-        <w:tblPrEx>
-          <w:tblCellMar>
-            <w:top w:w="0" w:type="dxa"/>
-            <w:bottom w:w="0" w:type="dxa"/>
-          </w:tblCellMar>
-        </w:tblPrEx>
         <w:tc>
           <w:tcPr>
             <w:tcW w:w="954" w:type="dxa"/>
@@ -419,12 +395,6 @@
         </w:tc>
       </w:tr>
       <w:tr>
-        <w:tblPrEx>
-          <w:tblCellMar>
-            <w:top w:w="0" w:type="dxa"/>
-            <w:bottom w:w="0" w:type="dxa"/>
-          </w:tblCellMar>
-        </w:tblPrEx>
         <w:tc>
           <w:tcPr>
             <w:tcW w:w="954" w:type="dxa"/>
@@ -505,12 +475,6 @@
         </w:tc>
       </w:tr>
       <w:tr>
-        <w:tblPrEx>
-          <w:tblCellMar>
-            <w:top w:w="0" w:type="dxa"/>
-            <w:bottom w:w="0" w:type="dxa"/>
-          </w:tblCellMar>
-        </w:tblPrEx>
         <w:tc>
           <w:tcPr>
             <w:tcW w:w="954" w:type="dxa"/>
@@ -594,12 +558,6 @@
         </w:tc>
       </w:tr>
       <w:tr>
-        <w:tblPrEx>
-          <w:tblCellMar>
-            <w:top w:w="0" w:type="dxa"/>
-            <w:bottom w:w="0" w:type="dxa"/>
-          </w:tblCellMar>
-        </w:tblPrEx>
         <w:tc>
           <w:tcPr>
             <w:tcW w:w="954" w:type="dxa"/>
@@ -680,12 +638,6 @@
         </w:tc>
       </w:tr>
       <w:tr>
-        <w:tblPrEx>
-          <w:tblCellMar>
-            <w:top w:w="0" w:type="dxa"/>
-            <w:bottom w:w="0" w:type="dxa"/>
-          </w:tblCellMar>
-        </w:tblPrEx>
         <w:tc>
           <w:tcPr>
             <w:tcW w:w="954" w:type="dxa"/>
@@ -769,12 +721,6 @@
         </w:tc>
       </w:tr>
       <w:tr>
-        <w:tblPrEx>
-          <w:tblCellMar>
-            <w:top w:w="0" w:type="dxa"/>
-            <w:bottom w:w="0" w:type="dxa"/>
-          </w:tblCellMar>
-        </w:tblPrEx>
         <w:tc>
           <w:tcPr>
             <w:tcW w:w="954" w:type="dxa"/>
@@ -855,12 +801,6 @@
         </w:tc>
       </w:tr>
       <w:tr>
-        <w:tblPrEx>
-          <w:tblCellMar>
-            <w:top w:w="0" w:type="dxa"/>
-            <w:bottom w:w="0" w:type="dxa"/>
-          </w:tblCellMar>
-        </w:tblPrEx>
         <w:tc>
           <w:tcPr>
             <w:tcW w:w="954" w:type="dxa"/>
@@ -944,12 +884,6 @@
         </w:tc>
       </w:tr>
       <w:tr>
-        <w:tblPrEx>
-          <w:tblCellMar>
-            <w:top w:w="0" w:type="dxa"/>
-            <w:bottom w:w="0" w:type="dxa"/>
-          </w:tblCellMar>
-        </w:tblPrEx>
         <w:tc>
           <w:tcPr>
             <w:tcW w:w="954" w:type="dxa"/>
@@ -1030,12 +964,6 @@
         </w:tc>
       </w:tr>
       <w:tr>
-        <w:tblPrEx>
-          <w:tblCellMar>
-            <w:top w:w="0" w:type="dxa"/>
-            <w:bottom w:w="0" w:type="dxa"/>
-          </w:tblCellMar>
-        </w:tblPrEx>
         <w:tc>
           <w:tcPr>
             <w:tcW w:w="954" w:type="dxa"/>
@@ -1119,12 +1047,6 @@
         </w:tc>
       </w:tr>
       <w:tr>
-        <w:tblPrEx>
-          <w:tblCellMar>
-            <w:top w:w="0" w:type="dxa"/>
-            <w:bottom w:w="0" w:type="dxa"/>
-          </w:tblCellMar>
-        </w:tblPrEx>
         <w:tc>
           <w:tcPr>
             <w:tcW w:w="954" w:type="dxa"/>
@@ -1205,12 +1127,6 @@
         </w:tc>
       </w:tr>
       <w:tr>
-        <w:tblPrEx>
-          <w:tblCellMar>
-            <w:top w:w="0" w:type="dxa"/>
-            <w:bottom w:w="0" w:type="dxa"/>
-          </w:tblCellMar>
-        </w:tblPrEx>
         <w:tc>
           <w:tcPr>
             <w:tcW w:w="954" w:type="dxa"/>
@@ -1294,12 +1210,6 @@
         </w:tc>
       </w:tr>
       <w:tr>
-        <w:tblPrEx>
-          <w:tblCellMar>
-            <w:top w:w="0" w:type="dxa"/>
-            <w:bottom w:w="0" w:type="dxa"/>
-          </w:tblCellMar>
-        </w:tblPrEx>
         <w:tc>
           <w:tcPr>
             <w:tcW w:w="954" w:type="dxa"/>
@@ -1380,12 +1290,6 @@
         </w:tc>
       </w:tr>
       <w:tr>
-        <w:tblPrEx>
-          <w:tblCellMar>
-            <w:top w:w="0" w:type="dxa"/>
-            <w:bottom w:w="0" w:type="dxa"/>
-          </w:tblCellMar>
-        </w:tblPrEx>
         <w:tc>
           <w:tcPr>
             <w:tcW w:w="954" w:type="dxa"/>
@@ -1469,12 +1373,6 @@
         </w:tc>
       </w:tr>
       <w:tr>
-        <w:tblPrEx>
-          <w:tblCellMar>
-            <w:top w:w="0" w:type="dxa"/>
-            <w:bottom w:w="0" w:type="dxa"/>
-          </w:tblCellMar>
-        </w:tblPrEx>
         <w:tc>
           <w:tcPr>
             <w:tcW w:w="954" w:type="dxa"/>
@@ -1555,12 +1453,6 @@
         </w:tc>
       </w:tr>
       <w:tr>
-        <w:tblPrEx>
-          <w:tblCellMar>
-            <w:top w:w="0" w:type="dxa"/>
-            <w:bottom w:w="0" w:type="dxa"/>
-          </w:tblCellMar>
-        </w:tblPrEx>
         <w:tc>
           <w:tcPr>
             <w:tcW w:w="954" w:type="dxa"/>
@@ -1645,12 +1537,6 @@
         </w:tc>
       </w:tr>
       <w:tr>
-        <w:tblPrEx>
-          <w:tblCellMar>
-            <w:top w:w="0" w:type="dxa"/>
-            <w:bottom w:w="0" w:type="dxa"/>
-          </w:tblCellMar>
-        </w:tblPrEx>
         <w:tc>
           <w:tcPr>
             <w:tcW w:w="954" w:type="dxa"/>
@@ -1731,12 +1617,6 @@
         </w:tc>
       </w:tr>
       <w:tr>
-        <w:tblPrEx>
-          <w:tblCellMar>
-            <w:top w:w="0" w:type="dxa"/>
-            <w:bottom w:w="0" w:type="dxa"/>
-          </w:tblCellMar>
-        </w:tblPrEx>
         <w:tc>
           <w:tcPr>
             <w:tcW w:w="954" w:type="dxa"/>
@@ -1820,12 +1700,6 @@
         </w:tc>
       </w:tr>
       <w:tr>
-        <w:tblPrEx>
-          <w:tblCellMar>
-            <w:top w:w="0" w:type="dxa"/>
-            <w:bottom w:w="0" w:type="dxa"/>
-          </w:tblCellMar>
-        </w:tblPrEx>
         <w:tc>
           <w:tcPr>
             <w:tcW w:w="954" w:type="dxa"/>
@@ -1906,12 +1780,6 @@
         </w:tc>
       </w:tr>
       <w:tr>
-        <w:tblPrEx>
-          <w:tblCellMar>
-            <w:top w:w="0" w:type="dxa"/>
-            <w:bottom w:w="0" w:type="dxa"/>
-          </w:tblCellMar>
-        </w:tblPrEx>
         <w:tc>
           <w:tcPr>
             <w:tcW w:w="954" w:type="dxa"/>
@@ -1992,12 +1860,6 @@
         </w:tc>
       </w:tr>
       <w:tr>
-        <w:tblPrEx>
-          <w:tblCellMar>
-            <w:top w:w="0" w:type="dxa"/>
-            <w:bottom w:w="0" w:type="dxa"/>
-          </w:tblCellMar>
-        </w:tblPrEx>
         <w:tc>
           <w:tcPr>
             <w:tcW w:w="954" w:type="dxa"/>
@@ -2046,14 +1908,7 @@
                 <w:sz w:val="18"/>
                 <w:szCs w:val="18"/>
               </w:rPr>
-              <w:t>Asignaciones en training-service (arquitectu</w:t>
-            </w:r>
-            <w:r>
-              <w:rPr>
-                <w:sz w:val="18"/>
-                <w:szCs w:val="18"/>
-              </w:rPr>
-              <w:t>ra)</w:t>
+              <w:t>Asignaciones en training-service (arquitectura)</w:t>
             </w:r>
           </w:p>
         </w:tc>
@@ -2085,12 +1940,6 @@
         </w:tc>
       </w:tr>
       <w:tr>
-        <w:tblPrEx>
-          <w:tblCellMar>
-            <w:top w:w="0" w:type="dxa"/>
-            <w:bottom w:w="0" w:type="dxa"/>
-          </w:tblCellMar>
-        </w:tblPrEx>
         <w:tc>
           <w:tcPr>
             <w:tcW w:w="954" w:type="dxa"/>
@@ -2165,25 +2014,12 @@
                 <w:sz w:val="18"/>
                 <w:szCs w:val="18"/>
               </w:rPr>
-              <w:t>booking-service le pide a members-s</w:t>
-            </w:r>
-            <w:r>
-              <w:rPr>
-                <w:sz w:val="18"/>
-                <w:szCs w:val="18"/>
-              </w:rPr>
-              <w:t>ervice los nombres de los alumnos de una clase. Si members-service no responde, el listado se muestra con los IDs y sin nombres (HU-21). Ver ADR-005.</w:t>
+              <w:t>booking-service le pide a members-service los nombres de los alumnos de una clase. Si members-service no responde, el listado se muestra con los IDs y sin nombres (HU-21). Ver ADR-005.</w:t>
             </w:r>
           </w:p>
         </w:tc>
       </w:tr>
       <w:tr>
-        <w:tblPrEx>
-          <w:tblCellMar>
-            <w:top w:w="0" w:type="dxa"/>
-            <w:bottom w:w="0" w:type="dxa"/>
-          </w:tblCellMar>
-        </w:tblPrEx>
         <w:tc>
           <w:tcPr>
             <w:tcW w:w="954" w:type="dxa"/>
@@ -2258,25 +2094,12 @@
                 <w:sz w:val="18"/>
                 <w:szCs w:val="18"/>
               </w:rPr>
-              <w:t>Todo el sistema en una VM con Docker Compose, igual que en loca</w:t>
-            </w:r>
-            <w:r>
-              <w:rPr>
-                <w:sz w:val="18"/>
-                <w:szCs w:val="18"/>
-              </w:rPr>
-              <w:t>l. Solo el api-gateway queda expuesto a Internet por HTTPS. Proveedor de nube todavía no elegido. Ver docs/ARCHITECTURE.md §14.2.</w:t>
+              <w:t>Todo el sistema en una VM con Docker Compose, igual que en local. Solo el api-gateway queda expuesto a Internet por HTTPS. Proveedor de nube todavía no elegido. Ver docs/ARCHITECTURE.md §14.2.</w:t>
             </w:r>
           </w:p>
         </w:tc>
       </w:tr>
       <w:tr>
-        <w:tblPrEx>
-          <w:tblCellMar>
-            <w:top w:w="0" w:type="dxa"/>
-            <w:bottom w:w="0" w:type="dxa"/>
-          </w:tblCellMar>
-        </w:tblPrEx>
         <w:tc>
           <w:tcPr>
             <w:tcW w:w="954" w:type="dxa"/>
@@ -2357,12 +2180,6 @@
         </w:tc>
       </w:tr>
       <w:tr>
-        <w:tblPrEx>
-          <w:tblCellMar>
-            <w:top w:w="0" w:type="dxa"/>
-            <w:bottom w:w="0" w:type="dxa"/>
-          </w:tblCellMar>
-        </w:tblPrEx>
         <w:tc>
           <w:tcPr>
             <w:tcW w:w="954" w:type="dxa"/>
@@ -2437,25 +2254,12 @@
                 <w:sz w:val="18"/>
                 <w:szCs w:val="18"/>
               </w:rPr>
-              <w:t>Además de los pedidos se agregan BENEFIT_NOT_FOUND (404), B</w:t>
-            </w:r>
-            <w:r>
-              <w:rPr>
-                <w:sz w:val="18"/>
-                <w:szCs w:val="18"/>
-              </w:rPr>
-              <w:t>ENEFIT_NOT_AVAILABLE (422) e IDEMPOTENCY_IN_PROGRESS (409, reintentable con la misma key).</w:t>
+              <w:t>Además de los pedidos se agregan BENEFIT_NOT_FOUND (404), BENEFIT_NOT_AVAILABLE (422) e IDEMPOTENCY_IN_PROGRESS (409, reintentable con la misma key).</w:t>
             </w:r>
           </w:p>
         </w:tc>
       </w:tr>
       <w:tr>
-        <w:tblPrEx>
-          <w:tblCellMar>
-            <w:top w:w="0" w:type="dxa"/>
-            <w:bottom w:w="0" w:type="dxa"/>
-          </w:tblCellMar>
-        </w:tblPrEx>
         <w:tc>
           <w:tcPr>
             <w:tcW w:w="954" w:type="dxa"/>
@@ -2536,12 +2340,6 @@
         </w:tc>
       </w:tr>
       <w:tr>
-        <w:tblPrEx>
-          <w:tblCellMar>
-            <w:top w:w="0" w:type="dxa"/>
-            <w:bottom w:w="0" w:type="dxa"/>
-          </w:tblCellMar>
-        </w:tblPrEx>
         <w:tc>
           <w:tcPr>
             <w:tcW w:w="954" w:type="dxa"/>
@@ -2616,25 +2414,12 @@
                 <w:sz w:val="18"/>
                 <w:szCs w:val="18"/>
               </w:rPr>
-              <w:t>En producción: https://&lt;host&gt;/partner-api/v1/... a través del api-gateway. En el mo</w:t>
-            </w:r>
-            <w:r>
-              <w:rPr>
-                <w:sz w:val="18"/>
-                <w:szCs w:val="18"/>
-              </w:rPr>
-              <w:t>ck local: http://localhost:4010/v1/... Contrato en inglés y camelCase (excepción a la convención interna).</w:t>
+              <w:t>En producción: https://&lt;host&gt;/partner-api/v1/... a través del api-gateway. En el mock local: http://localhost:4010/v1/... Contrato en inglés y camelCase (excepción a la convención interna).</w:t>
             </w:r>
           </w:p>
         </w:tc>
       </w:tr>
       <w:tr>
-        <w:tblPrEx>
-          <w:tblCellMar>
-            <w:top w:w="0" w:type="dxa"/>
-            <w:bottom w:w="0" w:type="dxa"/>
-          </w:tblCellMar>
-        </w:tblPrEx>
         <w:tc>
           <w:tcPr>
             <w:tcW w:w="954" w:type="dxa"/>
@@ -2715,12 +2500,6 @@
         </w:tc>
       </w:tr>
       <w:tr>
-        <w:tblPrEx>
-          <w:tblCellMar>
-            <w:top w:w="0" w:type="dxa"/>
-            <w:bottom w:w="0" w:type="dxa"/>
-          </w:tblCellMar>
-        </w:tblPrEx>
         <w:tc>
           <w:tcPr>
             <w:tcW w:w="954" w:type="dxa"/>
@@ -2769,14 +2548,7 @@
                 <w:sz w:val="18"/>
                 <w:szCs w:val="18"/>
               </w:rPr>
-              <w:t>Rutas públicas del api-gateway (arquitectu</w:t>
-            </w:r>
-            <w:r>
-              <w:rPr>
-                <w:sz w:val="18"/>
-                <w:szCs w:val="18"/>
-              </w:rPr>
-              <w:t>ra)</w:t>
+              <w:t>Rutas públicas del api-gateway (arquitectura)</w:t>
             </w:r>
           </w:p>
         </w:tc>
@@ -2802,32 +2574,12 @@
                 <w:sz w:val="18"/>
                 <w:szCs w:val="18"/>
               </w:rPr>
-              <w:t>Los prefijos públicos van en inglés: /api/v1/auth, users, memberships, activities, classes, bookings, check-ins, benefits, training y nutrition</w:t>
-            </w:r>
-            <w:r>
-              <w:rPr>
-                <w:sz w:val="18"/>
-                <w:szCs w:val="18"/>
-              </w:rPr>
-              <w:t>, más /partner-api/v1. El dominio, el código y los campos JSON siguen en español y snake_case. Ver docs/ARCH</w:t>
-            </w:r>
-            <w:r>
-              <w:rPr>
-                <w:sz w:val="18"/>
-                <w:szCs w:val="18"/>
-              </w:rPr>
-              <w:t>ITECTURE.md §5.2.</w:t>
+              <w:t>Los prefijos públicos van en inglés: /api/v1/auth, users, memberships, activities, classes, bookings, check-ins, benefits, training y nutrition, más /partner-api/v1. El dominio, el código y los campos JSON siguen en español y snake_case. Ver docs/ARCHITECTURE.md §5.2.</w:t>
             </w:r>
           </w:p>
         </w:tc>
       </w:tr>
       <w:tr>
-        <w:tblPrEx>
-          <w:tblCellMar>
-            <w:top w:w="0" w:type="dxa"/>
-            <w:bottom w:w="0" w:type="dxa"/>
-          </w:tblCellMar>
-        </w:tblPrEx>
         <w:tc>
           <w:tcPr>
             <w:tcW w:w="954" w:type="dxa"/>
@@ -2902,14 +2654,7 @@
                 <w:sz w:val="18"/>
                 <w:szCs w:val="18"/>
               </w:rPr>
-              <w:t>booking-service y benefits-service usan internal/domain (solo biblioteca estándar, sin tags), internal/application (casos de uso y puertos de entrada), internal/ports (puertos d</w:t>
-            </w:r>
-            <w:r>
-              <w:rPr>
-                <w:sz w:val="18"/>
-                <w:szCs w:val="18"/>
-              </w:rPr>
-              <w:t>e salida) e internal/adapters (http, postgres…). Lo verifican tests de arquitectura. Ver ADR-002.</w:t>
+              <w:t>booking-service y benefits-service usan internal/domain (solo biblioteca estándar, sin tags), internal/application (casos de uso y puertos de entrada), internal/ports (puertos de salida) e internal/adapters (http, postgres…). Lo verifican tests de arquitectura. Ver ADR-002.</w:t>
             </w:r>
           </w:p>
         </w:tc>
@@ -2967,12 +2712,6 @@
         <w:gridCol w:w="7404"/>
       </w:tblGrid>
       <w:tr>
-        <w:tblPrEx>
-          <w:tblCellMar>
-            <w:top w:w="0" w:type="dxa"/>
-            <w:bottom w:w="0" w:type="dxa"/>
-          </w:tblCellMar>
-        </w:tblPrEx>
         <w:trPr>
           <w:tblHeader/>
         </w:trPr>
@@ -3039,12 +2778,6 @@
         </w:tc>
       </w:tr>
       <w:tr>
-        <w:tblPrEx>
-          <w:tblCellMar>
-            <w:top w:w="0" w:type="dxa"/>
-            <w:bottom w:w="0" w:type="dxa"/>
-          </w:tblCellMar>
-        </w:tblPrEx>
         <w:tc>
           <w:tcPr>
             <w:tcW w:w="2234" w:type="dxa"/>
@@ -3099,12 +2832,6 @@
         </w:tc>
       </w:tr>
       <w:tr>
-        <w:tblPrEx>
-          <w:tblCellMar>
-            <w:top w:w="0" w:type="dxa"/>
-            <w:bottom w:w="0" w:type="dxa"/>
-          </w:tblCellMar>
-        </w:tblPrEx>
         <w:tc>
           <w:tcPr>
             <w:tcW w:w="2234" w:type="dxa"/>
@@ -3159,12 +2886,6 @@
         </w:tc>
       </w:tr>
       <w:tr>
-        <w:tblPrEx>
-          <w:tblCellMar>
-            <w:top w:w="0" w:type="dxa"/>
-            <w:bottom w:w="0" w:type="dxa"/>
-          </w:tblCellMar>
-        </w:tblPrEx>
         <w:tc>
           <w:tcPr>
             <w:tcW w:w="2234" w:type="dxa"/>
@@ -3219,12 +2940,6 @@
         </w:tc>
       </w:tr>
       <w:tr>
-        <w:tblPrEx>
-          <w:tblCellMar>
-            <w:top w:w="0" w:type="dxa"/>
-            <w:bottom w:w="0" w:type="dxa"/>
-          </w:tblCellMar>
-        </w:tblPrEx>
         <w:tc>
           <w:tcPr>
             <w:tcW w:w="2234" w:type="dxa"/>
@@ -3327,6 +3042,51 @@
       </w:pPr>
       <w:r>
         <w:t>Se actualizan D-02, D-04, D-05 y D-14; se reemplaza la asistencia manual del profesor por ingreso con DNI, se fija la cancelación hasta 1 hora antes y se incorpora la penalización por inasistencia.</w:t>
+      </w:r>
+    </w:p>
+    <w:p>
+      <w:pPr>
+        <w:spacing w:after="120"/>
+      </w:pPr>
+      <w:r>
+        <w:t>D-32</w:t>
+      </w:r>
+    </w:p>
+    <w:p>
+      <w:pPr>
+        <w:spacing w:after="120"/>
+      </w:pPr>
+      <w:r>
+        <w:t>Avisos de vencimiento de membresía</w:t>
+      </w:r>
+    </w:p>
+    <w:p>
+      <w:pPr>
+        <w:spacing w:after="120"/>
+      </w:pPr>
+      <w:r>
+        <w:t>METALFITNESS envía al alumno un recordatorio 10 días calendario antes del vencimiento y una advertencia durante el día del vencimiento. Los envíos son asíncronos, idempotentes por membresía y tipo, y no dependen del partner externo.</w:t>
+      </w:r>
+    </w:p>
+    <w:p>
+      <w:pPr>
+        <w:spacing w:after="120"/>
+      </w:pPr>
+    </w:p>
+    <w:p>
+      <w:pPr>
+        <w:spacing w:after="120"/>
+      </w:pPr>
+      <w:r>
+        <w:t>07/10/2026</w:t>
+      </w:r>
+    </w:p>
+    <w:p>
+      <w:pPr>
+        <w:spacing w:after="120"/>
+      </w:pPr>
+      <w:r>
+        <w:t>Se agregan los avisos de vencimiento: recordatorio 10 días antes y advertencia el día del vencimiento, enviados por notification-worker.</w:t>
       </w:r>
     </w:p>
     <w:sectPr>

</xml_diff>

<commit_message>
docs(decisions): actualizar decisiones reemplazadas
</commit_message>
<xml_diff>
--- a/Registro_de_Decisiones_Gimnasio.docx
+++ b/Registro_de_Decisiones_Gimnasio.docx
@@ -47,7 +47,7 @@
           <w:sz w:val="18"/>
           <w:szCs w:val="18"/>
         </w:rPr>
-        <w:t>Última actualización: 7 de octubre de 2026</w:t>
+        <w:t>Última actualización: 8 de octubre de 2026</w:t>
       </w:r>
     </w:p>
     <w:p>
@@ -1882,7 +1882,7 @@
                 <w:sz w:val="18"/>
                 <w:szCs w:val="18"/>
               </w:rPr>
-              <w:t>D-21</w:t>
+              <w:t>D-22</w:t>
             </w:r>
           </w:p>
         </w:tc>
@@ -1908,7 +1908,7 @@
                 <w:sz w:val="18"/>
                 <w:szCs w:val="18"/>
               </w:rPr>
-              <w:t>Asignaciones en training-service (arquitectura)</w:t>
+              <w:t>Nombres de alumnos en los listados (arquitectura)</w:t>
             </w:r>
           </w:p>
         </w:tc>
@@ -1934,7 +1934,7 @@
                 <w:sz w:val="18"/>
                 <w:szCs w:val="18"/>
               </w:rPr>
-              <w:t>training-service le consulta a members-service si el alumno está asignado al profesional antes de cada operación, con caché de 60 segundos (RN-30). Ver ADR-005.</w:t>
+              <w:t>booking-service le pide a members-service los nombres de los alumnos de una clase. Si members-service no responde, el listado se muestra con los IDs y sin nombres (HU-21). Ver ADR-005.</w:t>
             </w:r>
           </w:p>
         </w:tc>
@@ -1962,7 +1962,7 @@
                 <w:sz w:val="18"/>
                 <w:szCs w:val="18"/>
               </w:rPr>
-              <w:t>D-22</w:t>
+              <w:t>D-24</w:t>
             </w:r>
           </w:p>
         </w:tc>
@@ -1988,7 +1988,7 @@
                 <w:sz w:val="18"/>
                 <w:szCs w:val="18"/>
               </w:rPr>
-              <w:t>Nombres de alumnos en los listados (arquitectura)</w:t>
+              <w:t>Retención de claves de idempotencia en la API de partners</w:t>
             </w:r>
           </w:p>
         </w:tc>
@@ -2014,7 +2014,7 @@
                 <w:sz w:val="18"/>
                 <w:szCs w:val="18"/>
               </w:rPr>
-              <w:t>booking-service le pide a members-service los nombres de los alumnos de una clase. Si members-service no responde, el listado se muestra con los IDs y sin nombres (HU-21). Ver ADR-005.</w:t>
+              <w:t>30 días (no 24 h), por partner, como fija RN-27 y D-08. Se guardan también las respuestas de error. Ver docs/contracts/README.md y ADR-008.</w:t>
             </w:r>
           </w:p>
         </w:tc>
@@ -2042,7 +2042,7 @@
                 <w:sz w:val="18"/>
                 <w:szCs w:val="18"/>
               </w:rPr>
-              <w:t>D-23</w:t>
+              <w:t>D-25</w:t>
             </w:r>
           </w:p>
         </w:tc>
@@ -2068,7 +2068,7 @@
                 <w:sz w:val="18"/>
                 <w:szCs w:val="18"/>
               </w:rPr>
-              <w:t>Despliegue en la nube (arquitectura)</w:t>
+              <w:t>Códigos de error adicionales en la API de partners</w:t>
             </w:r>
           </w:p>
         </w:tc>
@@ -2094,7 +2094,7 @@
                 <w:sz w:val="18"/>
                 <w:szCs w:val="18"/>
               </w:rPr>
-              <w:t>Todo el sistema en una VM con Docker Compose, igual que en local. Solo el api-gateway queda expuesto a Internet por HTTPS. Proveedor de nube todavía no elegido. Ver docs/ARCHITECTURE.md §14.2.</w:t>
+              <w:t>Además de los pedidos se agregan BENEFIT_NOT_FOUND (404), BENEFIT_NOT_AVAILABLE (422) e IDEMPOTENCY_IN_PROGRESS (409, reintentable con la misma key).</w:t>
             </w:r>
           </w:p>
         </w:tc>
@@ -2122,7 +2122,7 @@
                 <w:sz w:val="18"/>
                 <w:szCs w:val="18"/>
               </w:rPr>
-              <w:t>D-24</w:t>
+              <w:t>D-26</w:t>
             </w:r>
           </w:p>
         </w:tc>
@@ -2148,7 +2148,7 @@
                 <w:sz w:val="18"/>
                 <w:szCs w:val="18"/>
               </w:rPr>
-              <w:t>Retención de claves de idempotencia en la API de partners</w:t>
+              <w:t>Máximo de puntos por operación</w:t>
             </w:r>
           </w:p>
         </w:tc>
@@ -2174,7 +2174,7 @@
                 <w:sz w:val="18"/>
                 <w:szCs w:val="18"/>
               </w:rPr>
-              <w:t>30 días (no 24 h), por partner, como fija RN-27 y D-08. Se guardan también las respuestas de error. Ver docs/contracts/README.md y ADR-008.</w:t>
+              <w:t>De 1 a 1.000.000 puntos por operación. Es un límite técnico de validación del contrato, no un tope de negocio (D-08 sigue vigente).</w:t>
             </w:r>
           </w:p>
         </w:tc>
@@ -2202,7 +2202,7 @@
                 <w:sz w:val="18"/>
                 <w:szCs w:val="18"/>
               </w:rPr>
-              <w:t>D-25</w:t>
+              <w:t>D-27</w:t>
             </w:r>
           </w:p>
         </w:tc>
@@ -2228,7 +2228,7 @@
                 <w:sz w:val="18"/>
                 <w:szCs w:val="18"/>
               </w:rPr>
-              <w:t>Códigos de error adicionales en la API de partners</w:t>
+              <w:t>Ruta pública de la API de partners</w:t>
             </w:r>
           </w:p>
         </w:tc>
@@ -2254,7 +2254,7 @@
                 <w:sz w:val="18"/>
                 <w:szCs w:val="18"/>
               </w:rPr>
-              <w:t>Además de los pedidos se agregan BENEFIT_NOT_FOUND (404), BENEFIT_NOT_AVAILABLE (422) e IDEMPOTENCY_IN_PROGRESS (409, reintentable con la misma key).</w:t>
+              <w:t>En producción: https://&lt;host&gt;/partner-api/v1/... a través del api-gateway. En el mock local: http://localhost:4010/v1/... Contrato en inglés y camelCase (excepción a la convención interna).</w:t>
             </w:r>
           </w:p>
         </w:tc>
@@ -2282,7 +2282,7 @@
                 <w:sz w:val="18"/>
                 <w:szCs w:val="18"/>
               </w:rPr>
-              <w:t>D-26</w:t>
+              <w:t>D-28</w:t>
             </w:r>
           </w:p>
         </w:tc>
@@ -2308,7 +2308,7 @@
                 <w:sz w:val="18"/>
                 <w:szCs w:val="18"/>
               </w:rPr>
-              <w:t>Máximo de puntos por operación</w:t>
+              <w:t>Vinculación de usuarios de partners</w:t>
             </w:r>
           </w:p>
         </w:tc>
@@ -2334,7 +2334,7 @@
                 <w:sz w:val="18"/>
                 <w:szCs w:val="18"/>
               </w:rPr>
-              <w:t>De 1 a 1.000.000 puntos por operación. Es un límite técnico de validación del contrato, no un tope de negocio (D-08 sigue vigente).</w:t>
+              <w:t>Solo el administrador del gimnasio vincula cada alumno con el externalUserId del partner (HU-10). El partner no puede vincular por la API; si opera sobre un usuario no vinculado recibe 404 ACCOUNT_NOT_FOUND.</w:t>
             </w:r>
           </w:p>
         </w:tc>
@@ -2362,7 +2362,7 @@
                 <w:sz w:val="18"/>
                 <w:szCs w:val="18"/>
               </w:rPr>
-              <w:t>D-27</w:t>
+              <w:t>D-29</w:t>
             </w:r>
           </w:p>
         </w:tc>
@@ -2388,7 +2388,7 @@
                 <w:sz w:val="18"/>
                 <w:szCs w:val="18"/>
               </w:rPr>
-              <w:t>Ruta pública de la API de partners</w:t>
+              <w:t>Rutas públicas del api-gateway (arquitectura)</w:t>
             </w:r>
           </w:p>
         </w:tc>
@@ -2414,7 +2414,7 @@
                 <w:sz w:val="18"/>
                 <w:szCs w:val="18"/>
               </w:rPr>
-              <w:t>En producción: https://&lt;host&gt;/partner-api/v1/... a través del api-gateway. En el mock local: http://localhost:4010/v1/... Contrato en inglés y camelCase (excepción a la convención interna).</w:t>
+              <w:t>Los prefijos públicos van en inglés: /api/v1/auth, users, memberships, activities, classes, bookings, check-ins, benefits, training y nutrition, más /partner-api/v1. El dominio, el código y los campos JSON siguen en español y snake_case. Ver docs/ARCHITECTURE.md §5.2.</w:t>
             </w:r>
           </w:p>
         </w:tc>
@@ -2442,7 +2442,7 @@
                 <w:sz w:val="18"/>
                 <w:szCs w:val="18"/>
               </w:rPr>
-              <w:t>D-28</w:t>
+              <w:t>D-30</w:t>
             </w:r>
           </w:p>
         </w:tc>
@@ -2468,7 +2468,7 @@
                 <w:sz w:val="18"/>
                 <w:szCs w:val="18"/>
               </w:rPr>
-              <w:t>Vinculación de usuarios de partners</w:t>
+              <w:t>Estructura de los servicios hexagonales (arquitectura)</w:t>
             </w:r>
           </w:p>
         </w:tc>
@@ -2494,7 +2494,7 @@
                 <w:sz w:val="18"/>
                 <w:szCs w:val="18"/>
               </w:rPr>
-              <w:t>Solo el administrador del gimnasio vincula cada alumno con el externalUserId del partner (HU-10). El partner no puede vincular por la API; si opera sobre un usuario no vinculado recibe 404 ACCOUNT_NOT_FOUND.</w:t>
+              <w:t>booking-service y benefits-service usan internal/domain (solo biblioteca estándar, sin tags), internal/application (casos de uso y puertos de entrada), internal/ports (puertos de salida) e internal/adapters (http, postgres…). Lo verifican tests de arquitectura. Ver ADR-002.</w:t>
             </w:r>
           </w:p>
         </w:tc>
@@ -2522,7 +2522,7 @@
                 <w:sz w:val="18"/>
                 <w:szCs w:val="18"/>
               </w:rPr>
-              <w:t>D-29</w:t>
+              <w:t>D-33</w:t>
             </w:r>
           </w:p>
         </w:tc>
@@ -2548,7 +2548,7 @@
                 <w:sz w:val="18"/>
                 <w:szCs w:val="18"/>
               </w:rPr>
-              <w:t>Rutas públicas del api-gateway (arquitectura)</w:t>
+              <w:t>Asignaciones en training-service sin caché (arquitectura)</w:t>
             </w:r>
           </w:p>
         </w:tc>
@@ -2574,7 +2574,7 @@
                 <w:sz w:val="18"/>
                 <w:szCs w:val="18"/>
               </w:rPr>
-              <w:t>Los prefijos públicos van en inglés: /api/v1/auth, users, memberships, activities, classes, bookings, check-ins, benefits, training y nutrition, más /partner-api/v1. El dominio, el código y los campos JSON siguen en español y snake_case. Ver docs/ARCHITECTURE.md §5.2.</w:t>
+              <w:t>Reemplaza D-21. training-service consulta a members-service la asignación vigente antes de cada operación protegida. La autorización no se cachea; si members-service no puede confirmarla, la operación falla cerrada sin modificar datos (RN-30). Ver ADR-007.</w:t>
             </w:r>
           </w:p>
         </w:tc>
@@ -2602,7 +2602,7 @@
                 <w:sz w:val="18"/>
                 <w:szCs w:val="18"/>
               </w:rPr>
-              <w:t>D-30</w:t>
+              <w:t>D-34</w:t>
             </w:r>
           </w:p>
         </w:tc>
@@ -2628,7 +2628,7 @@
                 <w:sz w:val="18"/>
                 <w:szCs w:val="18"/>
               </w:rPr>
-              <w:t>Estructura de los servicios hexagonales (arquitectura)</w:t>
+              <w:t>Borde público del despliegue (arquitectura)</w:t>
             </w:r>
           </w:p>
         </w:tc>
@@ -2654,7 +2654,7 @@
                 <w:sz w:val="18"/>
                 <w:szCs w:val="18"/>
               </w:rPr>
-              <w:t>booking-service y benefits-service usan internal/domain (solo biblioteca estándar, sin tags), internal/application (casos de uso y puertos de entrada), internal/ports (puertos de salida) e internal/adapters (http, postgres…). Lo verifican tests de arquitectura. Ver ADR-002.</w:t>
+              <w:t>Reemplaza D-23. El stack se despliega en una VM con Docker Compose. Traefik es la única entrada pública HTTPS: sirve la SPA y enruta las APIs al api-gateway. Los servicios y la infraestructura quedan en una red privada. El proveedor de nube sigue pendiente. Ver docs/ARCHITECTURE.md §10 y §14.2, y ADR-006.</w:t>
             </w:r>
           </w:p>
         </w:tc>
@@ -2673,14 +2673,285 @@
         <w:t>Decisiones reemplazadas</w:t>
       </w:r>
     </w:p>
-    <w:p>
-      <w:pPr>
-        <w:spacing w:after="100"/>
-      </w:pPr>
-      <w:r>
-        <w:t>Todavía no hay decisiones reemplazadas.</w:t>
-      </w:r>
-    </w:p>
+    <w:tbl>
+      <w:tblPr>
+        <w:tblW w:w="9638" w:type="dxa"/>
+        <w:tblBorders>
+          <w:top w:val="single" w:sz="4" w:space="0" w:color="auto"/>
+          <w:left w:val="single" w:sz="4" w:space="0" w:color="auto"/>
+          <w:bottom w:val="single" w:sz="4" w:space="0" w:color="auto"/>
+          <w:right w:val="single" w:sz="4" w:space="0" w:color="auto"/>
+          <w:insideH w:val="single" w:sz="4" w:space="0" w:color="auto"/>
+          <w:insideV w:val="single" w:sz="4" w:space="0" w:color="auto"/>
+        </w:tblBorders>
+        <w:tblLayout w:type="fixed"/>
+        <w:tblCellMar>
+          <w:left w:w="10" w:type="dxa"/>
+          <w:right w:w="10" w:type="dxa"/>
+        </w:tblCellMar>
+        <w:tblLook w:val="04A0" w:firstRow="1" w:lastRow="0" w:firstColumn="1" w:lastColumn="0" w:noHBand="0" w:noVBand="1"/>
+      </w:tblPr>
+      <w:tblGrid>
+        <w:gridCol w:w="954"/>
+        <w:gridCol w:w="2958"/>
+        <w:gridCol w:w="5726"/>
+      </w:tblGrid>
+      <w:tr>
+        <w:trPr>
+          <w:tblHeader/>
+        </w:trPr>
+        <w:tc>
+          <w:tcPr>
+            <w:tcW w:w="954" w:type="dxa"/>
+            <w:tcBorders>
+              <w:top w:val="single" w:sz="4" w:space="0" w:color="BFBFBF"/>
+              <w:left w:val="single" w:sz="4" w:space="0" w:color="BFBFBF"/>
+              <w:bottom w:val="single" w:sz="4" w:space="0" w:color="BFBFBF"/>
+              <w:right w:val="single" w:sz="4" w:space="0" w:color="BFBFBF"/>
+            </w:tcBorders>
+            <w:shd w:val="clear" w:color="auto" w:fill="1F4E79"/>
+            <w:tcMar>
+              <w:top w:w="60" w:type="dxa"/>
+              <w:left w:w="100" w:type="dxa"/>
+              <w:bottom w:w="60" w:type="dxa"/>
+              <w:right w:w="100" w:type="dxa"/>
+            </w:tcMar>
+          </w:tcPr>
+          <w:p>
+            <w:r>
+              <w:rPr>
+                <w:b/>
+                <w:bCs/>
+                <w:color w:val="FFFFFF"/>
+                <w:sz w:val="18"/>
+                <w:szCs w:val="18"/>
+              </w:rPr>
+              <w:t>ID</w:t>
+            </w:r>
+          </w:p>
+        </w:tc>
+        <w:tc>
+          <w:tcPr>
+            <w:tcW w:w="2958" w:type="dxa"/>
+            <w:tcBorders>
+              <w:top w:val="single" w:sz="4" w:space="0" w:color="BFBFBF"/>
+              <w:left w:val="single" w:sz="4" w:space="0" w:color="BFBFBF"/>
+              <w:bottom w:val="single" w:sz="4" w:space="0" w:color="BFBFBF"/>
+              <w:right w:val="single" w:sz="4" w:space="0" w:color="BFBFBF"/>
+            </w:tcBorders>
+            <w:shd w:val="clear" w:color="auto" w:fill="1F4E79"/>
+            <w:tcMar>
+              <w:top w:w="60" w:type="dxa"/>
+              <w:left w:w="100" w:type="dxa"/>
+              <w:bottom w:w="60" w:type="dxa"/>
+              <w:right w:w="100" w:type="dxa"/>
+            </w:tcMar>
+          </w:tcPr>
+          <w:p>
+            <w:r>
+              <w:rPr>
+                <w:b/>
+                <w:bCs/>
+                <w:color w:val="FFFFFF"/>
+                <w:sz w:val="18"/>
+                <w:szCs w:val="18"/>
+              </w:rPr>
+              <w:t>Tema</w:t>
+            </w:r>
+          </w:p>
+        </w:tc>
+        <w:tc>
+          <w:tcPr>
+            <w:tcW w:w="5726" w:type="dxa"/>
+            <w:tcBorders>
+              <w:top w:val="single" w:sz="4" w:space="0" w:color="BFBFBF"/>
+              <w:left w:val="single" w:sz="4" w:space="0" w:color="BFBFBF"/>
+              <w:bottom w:val="single" w:sz="4" w:space="0" w:color="BFBFBF"/>
+              <w:right w:val="single" w:sz="4" w:space="0" w:color="BFBFBF"/>
+            </w:tcBorders>
+            <w:shd w:val="clear" w:color="auto" w:fill="1F4E79"/>
+            <w:tcMar>
+              <w:top w:w="60" w:type="dxa"/>
+              <w:left w:w="100" w:type="dxa"/>
+              <w:bottom w:w="60" w:type="dxa"/>
+              <w:right w:w="100" w:type="dxa"/>
+            </w:tcMar>
+          </w:tcPr>
+          <w:p>
+            <w:r>
+              <w:rPr>
+                <w:b/>
+                <w:bCs/>
+                <w:color w:val="FFFFFF"/>
+                <w:sz w:val="18"/>
+                <w:szCs w:val="18"/>
+              </w:rPr>
+              <w:t>Decisión</w:t>
+            </w:r>
+          </w:p>
+        </w:tc>
+      </w:tr>
+      <w:tr>
+        <w:tc>
+          <w:tcPr>
+            <w:tcW w:w="954" w:type="dxa"/>
+            <w:tcBorders>
+              <w:top w:val="single" w:sz="4" w:space="0" w:color="BFBFBF"/>
+              <w:left w:val="single" w:sz="4" w:space="0" w:color="BFBFBF"/>
+              <w:bottom w:val="single" w:sz="4" w:space="0" w:color="BFBFBF"/>
+              <w:right w:val="single" w:sz="4" w:space="0" w:color="BFBFBF"/>
+            </w:tcBorders>
+            <w:tcMar>
+              <w:top w:w="60" w:type="dxa"/>
+              <w:left w:w="100" w:type="dxa"/>
+              <w:bottom w:w="60" w:type="dxa"/>
+              <w:right w:w="100" w:type="dxa"/>
+            </w:tcMar>
+          </w:tcPr>
+          <w:p>
+            <w:r>
+              <w:rPr>
+                <w:sz w:val="18"/>
+                <w:szCs w:val="18"/>
+              </w:rPr>
+              <w:t>D-21</w:t>
+            </w:r>
+          </w:p>
+        </w:tc>
+        <w:tc>
+          <w:tcPr>
+            <w:tcW w:w="2958" w:type="dxa"/>
+            <w:tcBorders>
+              <w:top w:val="single" w:sz="4" w:space="0" w:color="BFBFBF"/>
+              <w:left w:val="single" w:sz="4" w:space="0" w:color="BFBFBF"/>
+              <w:bottom w:val="single" w:sz="4" w:space="0" w:color="BFBFBF"/>
+              <w:right w:val="single" w:sz="4" w:space="0" w:color="BFBFBF"/>
+            </w:tcBorders>
+            <w:tcMar>
+              <w:top w:w="60" w:type="dxa"/>
+              <w:left w:w="100" w:type="dxa"/>
+              <w:bottom w:w="60" w:type="dxa"/>
+              <w:right w:w="100" w:type="dxa"/>
+            </w:tcMar>
+          </w:tcPr>
+          <w:p>
+            <w:r>
+              <w:rPr>
+                <w:sz w:val="18"/>
+                <w:szCs w:val="18"/>
+              </w:rPr>
+              <w:t>Asignaciones en training-service (reemplazada)</w:t>
+            </w:r>
+          </w:p>
+        </w:tc>
+        <w:tc>
+          <w:tcPr>
+            <w:tcW w:w="5726" w:type="dxa"/>
+            <w:tcBorders>
+              <w:top w:val="single" w:sz="4" w:space="0" w:color="BFBFBF"/>
+              <w:left w:val="single" w:sz="4" w:space="0" w:color="BFBFBF"/>
+              <w:bottom w:val="single" w:sz="4" w:space="0" w:color="BFBFBF"/>
+              <w:right w:val="single" w:sz="4" w:space="0" w:color="BFBFBF"/>
+            </w:tcBorders>
+            <w:tcMar>
+              <w:top w:w="60" w:type="dxa"/>
+              <w:left w:w="100" w:type="dxa"/>
+              <w:bottom w:w="60" w:type="dxa"/>
+              <w:right w:w="100" w:type="dxa"/>
+            </w:tcMar>
+          </w:tcPr>
+          <w:p>
+            <w:r>
+              <w:rPr>
+                <w:sz w:val="18"/>
+                <w:szCs w:val="18"/>
+              </w:rPr>
+              <w:t>Reemplazada por D-33 el 08/10/2026. Decisión anterior: training-service consultaba a members-service antes de cada operación y cacheaba la asignación durante 60 segundos.</w:t>
+            </w:r>
+          </w:p>
+        </w:tc>
+      </w:tr>
+      <w:tr>
+        <w:tc>
+          <w:tcPr>
+            <w:tcW w:w="954" w:type="dxa"/>
+            <w:tcBorders>
+              <w:top w:val="single" w:sz="4" w:space="0" w:color="BFBFBF"/>
+              <w:left w:val="single" w:sz="4" w:space="0" w:color="BFBFBF"/>
+              <w:bottom w:val="single" w:sz="4" w:space="0" w:color="BFBFBF"/>
+              <w:right w:val="single" w:sz="4" w:space="0" w:color="BFBFBF"/>
+            </w:tcBorders>
+            <w:tcMar>
+              <w:top w:w="60" w:type="dxa"/>
+              <w:left w:w="100" w:type="dxa"/>
+              <w:bottom w:w="60" w:type="dxa"/>
+              <w:right w:w="100" w:type="dxa"/>
+            </w:tcMar>
+          </w:tcPr>
+          <w:p>
+            <w:r>
+              <w:rPr>
+                <w:sz w:val="18"/>
+                <w:szCs w:val="18"/>
+              </w:rPr>
+              <w:t>D-23</w:t>
+            </w:r>
+          </w:p>
+        </w:tc>
+        <w:tc>
+          <w:tcPr>
+            <w:tcW w:w="2958" w:type="dxa"/>
+            <w:tcBorders>
+              <w:top w:val="single" w:sz="4" w:space="0" w:color="BFBFBF"/>
+              <w:left w:val="single" w:sz="4" w:space="0" w:color="BFBFBF"/>
+              <w:bottom w:val="single" w:sz="4" w:space="0" w:color="BFBFBF"/>
+              <w:right w:val="single" w:sz="4" w:space="0" w:color="BFBFBF"/>
+            </w:tcBorders>
+            <w:tcMar>
+              <w:top w:w="60" w:type="dxa"/>
+              <w:left w:w="100" w:type="dxa"/>
+              <w:bottom w:w="60" w:type="dxa"/>
+              <w:right w:w="100" w:type="dxa"/>
+            </w:tcMar>
+          </w:tcPr>
+          <w:p>
+            <w:r>
+              <w:rPr>
+                <w:sz w:val="18"/>
+                <w:szCs w:val="18"/>
+              </w:rPr>
+              <w:t>Despliegue en la nube (reemplazada)</w:t>
+            </w:r>
+          </w:p>
+        </w:tc>
+        <w:tc>
+          <w:tcPr>
+            <w:tcW w:w="5726" w:type="dxa"/>
+            <w:tcBorders>
+              <w:top w:val="single" w:sz="4" w:space="0" w:color="BFBFBF"/>
+              <w:left w:val="single" w:sz="4" w:space="0" w:color="BFBFBF"/>
+              <w:bottom w:val="single" w:sz="4" w:space="0" w:color="BFBFBF"/>
+              <w:right w:val="single" w:sz="4" w:space="0" w:color="BFBFBF"/>
+            </w:tcBorders>
+            <w:tcMar>
+              <w:top w:w="60" w:type="dxa"/>
+              <w:left w:w="100" w:type="dxa"/>
+              <w:bottom w:w="60" w:type="dxa"/>
+              <w:right w:w="100" w:type="dxa"/>
+            </w:tcMar>
+          </w:tcPr>
+          <w:p>
+            <w:r>
+              <w:rPr>
+                <w:sz w:val="18"/>
+                <w:szCs w:val="18"/>
+              </w:rPr>
+              <w:t>Reemplazada por D-34 el 08/10/2026. Decisión anterior: el stack se desplegaba en una VM con Docker Compose y se describía al api-gateway como único componente expuesto por HTTPS.</w:t>
+            </w:r>
+          </w:p>
+        </w:tc>
+      </w:tr>
+    </w:tbl>
     <w:p>
       <w:pPr>
         <w:pStyle w:val="Ttulo1"/>
@@ -2989,6 +3260,60 @@
                 <w:szCs w:val="18"/>
               </w:rPr>
               <w:t>Se agregan D-29 y D-30: rutas del gateway en inglés y estructura de los servicios hexagonales (etapa de esqueleto).</w:t>
+            </w:r>
+          </w:p>
+        </w:tc>
+      </w:tr>
+      <w:tr>
+        <w:tc>
+          <w:tcPr>
+            <w:tcW w:w="2234" w:type="dxa"/>
+            <w:tcBorders>
+              <w:top w:val="single" w:sz="4" w:space="0" w:color="BFBFBF"/>
+              <w:left w:val="single" w:sz="4" w:space="0" w:color="BFBFBF"/>
+              <w:bottom w:val="single" w:sz="4" w:space="0" w:color="BFBFBF"/>
+              <w:right w:val="single" w:sz="4" w:space="0" w:color="BFBFBF"/>
+            </w:tcBorders>
+            <w:tcMar>
+              <w:top w:w="60" w:type="dxa"/>
+              <w:left w:w="100" w:type="dxa"/>
+              <w:bottom w:w="60" w:type="dxa"/>
+              <w:right w:w="100" w:type="dxa"/>
+            </w:tcMar>
+          </w:tcPr>
+          <w:p>
+            <w:r>
+              <w:rPr>
+                <w:sz w:val="18"/>
+                <w:szCs w:val="18"/>
+              </w:rPr>
+              <w:t>08/10/2026</w:t>
+            </w:r>
+          </w:p>
+        </w:tc>
+        <w:tc>
+          <w:tcPr>
+            <w:tcW w:w="7404" w:type="dxa"/>
+            <w:tcBorders>
+              <w:top w:val="single" w:sz="4" w:space="0" w:color="BFBFBF"/>
+              <w:left w:val="single" w:sz="4" w:space="0" w:color="BFBFBF"/>
+              <w:bottom w:val="single" w:sz="4" w:space="0" w:color="BFBFBF"/>
+              <w:right w:val="single" w:sz="4" w:space="0" w:color="BFBFBF"/>
+            </w:tcBorders>
+            <w:tcMar>
+              <w:top w:w="60" w:type="dxa"/>
+              <w:left w:w="100" w:type="dxa"/>
+              <w:bottom w:w="60" w:type="dxa"/>
+              <w:right w:w="100" w:type="dxa"/>
+            </w:tcMar>
+          </w:tcPr>
+          <w:p>
+            <w:r>
+              <w:rPr>
+                <w:sz w:val="18"/>
+                <w:szCs w:val="18"/>
+              </w:rPr>
+              <w:t>D-33 reemplaza D-21: las asignaciones de autorización dejan de cachearse. D-34 reemplaza D-23: Traefik pasa a ser la única entrada pública HTTPS para la SPA y las APIs.</w:t>
             </w:r>
           </w:p>
         </w:tc>

</xml_diff>